<commit_message>
Updated SmartBite Use Case Document
</commit_message>
<xml_diff>
--- a/SmartBite_BA_Project/4_Use_Cases/SmartBite_Use_Cases.docx
+++ b/SmartBite_BA_Project/4_Use_Cases/SmartBite_Use_Cases.docx
@@ -4434,8 +4434,6 @@
         </w:rPr>
         <w:t>Admin, Payment Gateway</w:t>
       </w:r>
-      <w:bookmarkStart w:id="0" w:name="_GoBack"/>
-      <w:bookmarkEnd w:id="0"/>
     </w:p>
     <w:p>
       <w:pPr>
@@ -5039,7 +5037,41 @@
         </w:pict>
       </w:r>
     </w:p>
-    <w:p/>
+    <w:p>
+      <w:pPr>
+        <w:pStyle w:val="Heading2"/>
+      </w:pPr>
+      <w:r>
+        <w:rPr>
+          <w:sz w:val="32"/>
+          <w:szCs w:val="32"/>
+        </w:rPr>
+        <w:t>Conclusion</w:t>
+      </w:r>
+    </w:p>
+    <w:p>
+      <w:pPr>
+        <w:pStyle w:val="NormalWeb"/>
+      </w:pPr>
+      <w:r>
+        <w:t>The SmartBite Use Case Document explains the key functionalities of the SmartBite food ordering system, including login, order placement, payment, cancellation, and refund processing. It defines the interaction between users and the system through clear workflows, conditions, and alternate scenarios. This document helps ensure proper requirement understanding, smooth system development, and effective testing of the application.</w:t>
+      </w:r>
+      <w:r>
+        <w:br/>
+      </w:r>
+      <w:r>
+        <w:br/>
+      </w:r>
+      <w:r>
+        <w:pict w14:anchorId="7B5646EC">
+          <v:rect id="_x0000_i1033" style="width:0;height:1.5pt" o:hralign="center" o:hrstd="t" o:hr="t" fillcolor="#a0a0a0" stroked="f"/>
+        </w:pict>
+      </w:r>
+    </w:p>
+    <w:p>
+      <w:bookmarkStart w:id="0" w:name="_GoBack"/>
+      <w:bookmarkEnd w:id="0"/>
+    </w:p>
     <w:sectPr>
       <w:pgSz w:w="11906" w:h="16838"/>
       <w:pgMar w:top="1440" w:right="1440" w:bottom="1440" w:left="1440" w:header="708" w:footer="708" w:gutter="0"/>

</xml_diff>